<commit_message>
Plantilla Word: agrega membrete (logo UA nítido arriba a la derecha)
Mantiene el fondo difuminado gris claro como marca de agua y añade el
logo institucional sin difuminar en la esquina superior derecha. Margen
superior ampliado para que el membrete no pise el contenido.

Co-Authored-By: Claude Opus 4.8 <noreply@anthropic.com>
</commit_message>
<xml_diff>
--- a/entregables/Plantilla-Certificados-UA.docx
+++ b/entregables/Plantilla-Certificados-UA.docx
@@ -6,7 +6,7 @@
     <w:sectPr>
       <w:headerReference w:type="default" r:id="rId1"/>
       <w:pgSz w:w="11906" w:h="16838"/>
-      <w:pgMar w:top="1417" w:right="1417" w:bottom="1417" w:left="1417" w:header="0" w:footer="708" w:gutter="0"/>
+      <w:pgMar w:top="2155" w:right="1417" w:bottom="1417" w:left="1417" w:header="0" w:footer="708" w:gutter="0"/>
       <w:cols w:space="708"/>
       <w:docGrid w:linePitch="360"/>
     </w:sectPr>
@@ -19,7 +19,7 @@
   <w:p>
     <w:r>
       <w:drawing>
-        <wp:anchor distT="0" distB="0" distL="0" distR="0" simplePos="0" relativeHeight="0" behindDoc="1" locked="0" layoutInCell="1" allowOverlap="1">
+        <wp:anchor distT="0" distB="0" distL="0" distR="0" simplePos="0" relativeHeight="1" behindDoc="1" locked="0" layoutInCell="1" allowOverlap="1">
           <wp:simplePos x="0" y="0"/>
           <wp:positionH relativeFrom="page">
             <wp:posOffset>0</wp:posOffset>
@@ -36,7 +36,7 @@
             <a:graphicData uri="http://schemas.openxmlformats.org/drawingml/2006/picture">
               <pic:pic>
                 <pic:nvPicPr>
-                  <pic:cNvPr id="1" name="fondo-ua.png"/>
+                  <pic:cNvPr id="1" name="FondoUA"/>
                   <pic:cNvPicPr/>
                 </pic:nvPicPr>
                 <pic:blipFill>
@@ -60,6 +60,49 @@
         </wp:anchor>
       </w:drawing>
     </w:r>
+    <w:r>
+      <w:drawing>
+        <wp:anchor distT="0" distB="0" distL="0" distR="0" simplePos="0" relativeHeight="2" behindDoc="0" locked="0" layoutInCell="1" allowOverlap="1">
+          <wp:simplePos x="0" y="0"/>
+          <wp:positionH relativeFrom="page">
+            <wp:posOffset>5976000</wp:posOffset>
+          </wp:positionH>
+          <wp:positionV relativeFrom="page">
+            <wp:posOffset>288000</wp:posOffset>
+          </wp:positionV>
+          <wp:extent cx="1080000" cy="973763"/>
+          <wp:effectExtent l="0" t="0" r="0" b="0"/>
+          <wp:wrapNone/>
+          <wp:docPr id="2" name="MembreteUA"/>
+          <wp:cNvGraphicFramePr/>
+          <a:graphic>
+            <a:graphicData uri="http://schemas.openxmlformats.org/drawingml/2006/picture">
+              <pic:pic>
+                <pic:nvPicPr>
+                  <pic:cNvPr id="2" name="MembreteUA"/>
+                  <pic:cNvPicPr/>
+                </pic:nvPicPr>
+                <pic:blipFill>
+                  <a:blip r:embed="rId2"/>
+                  <a:stretch>
+                    <a:fillRect/>
+                  </a:stretch>
+                </pic:blipFill>
+                <pic:spPr>
+                  <a:xfrm>
+                    <a:off x="0" y="0"/>
+                    <a:ext cx="1080000" cy="973763"/>
+                  </a:xfrm>
+                  <a:prstGeom prst="rect">
+                    <a:avLst/>
+                  </a:prstGeom>
+                </pic:spPr>
+              </pic:pic>
+            </a:graphicData>
+          </a:graphic>
+        </wp:anchor>
+      </w:drawing>
+    </w:r>
   </w:p>
 </w:hdr>
 </file>
</xml_diff>